<commit_message>
Polish launch site and member assets
</commit_message>
<xml_diff>
--- a/content/member-assets/ai-inbox-triage-trades/ai-prompt-pack.docx
+++ b/content/member-assets/ai-inbox-triage-trades/ai-prompt-pack.docx
@@ -4,10 +4,10 @@
   <w:body>
     <w:p>
       <w:pPr>
-        <w:pStyle w:val="Subtitle"/>
-      </w:pPr>
-      <w:r>
-        <w:t xml:space="preserve">Side Hustle Stephen - The Launchpad</w:t>
+        <w:pStyle w:val="BrandBand"/>
+      </w:pPr>
+      <w:r>
+        <w:t xml:space="preserve">SIDE HUSTLE STEPHEN - THE LAUNCHPAD</w:t>
       </w:r>
     </w:p>
     <w:p>
@@ -36,8 +36,16 @@
     </w:p>
     <w:p>
       <w:pPr>
+        <w:pStyle w:val="Tagline"/>
+      </w:pPr>
+      <w:r>
+        <w:t xml:space="preserve">Plumbers do not need an AI agent. They need inbox triage.</w:t>
+      </w:r>
+    </w:p>
+    <w:p>
+      <w:pPr>
         <w:pBdr>
-          <w:bottom w:val="single" w:sz="8" w:space="1" w:color="D94A00"/>
+          <w:bottom w:val="single" w:sz="8" w:space="1" w:color="0A0A0A"/>
         </w:pBdr>
         <w:spacing w:before="70" w:after="210"/>
       </w:pPr>
@@ -55,7 +63,7 @@
         <w:pStyle w:val="Meta"/>
       </w:pPr>
       <w:r>
-        <w:t xml:space="preserve">Category: AI Tool | Startup cost: $1-$50 | First sale: 2-4 weeks | Difficulty: Medium</w:t>
+        <w:t xml:space="preserve">Category: AI Tool  /  Startup cost: $1-$50  /  First sale: 2-4 weeks  /  Difficulty: Medium</w:t>
       </w:r>
     </w:p>
     <w:p>
@@ -76,6 +84,41 @@
     </w:p>
     <w:p>
       <w:pPr>
+        <w:pStyle w:val="Kicker"/>
+      </w:pPr>
+      <w:r>
+        <w:t>IN THIS DOCUMENT</w:t>
+      </w:r>
+    </w:p>
+    <w:p>
+      <w:pPr>
+        <w:rPr>
+          <w:color w:val="57534E"/>
+          <w:sz w:val="18"/>
+        </w:rPr>
+      </w:pPr>
+      <w:r>
+        <w:fldChar w:fldCharType="begin"/>
+      </w:r>
+      <w:r>
+        <w:instrText xml:space="preserve"> TOC \o "1-1" \h \z \u </w:instrText>
+      </w:r>
+      <w:r>
+        <w:fldChar w:fldCharType="separate"/>
+      </w:r>
+      <w:r>
+        <w:rPr>
+          <w:color w:val="57534E"/>
+          <w:sz w:val="18"/>
+        </w:rPr>
+        <w:t xml:space="preserve">Right-click and choose Update Field to build the contents.</w:t>
+      </w:r>
+      <w:r>
+        <w:fldChar w:fldCharType="end"/>
+      </w:r>
+    </w:p>
+    <w:p>
+      <w:pPr>
         <w:pStyle w:val="Heading3"/>
       </w:pPr>
       <w:r>
@@ -87,7 +130,7 @@
         <w:pStyle w:val="Checklist"/>
       </w:pPr>
       <w:r>
-        <w:t xml:space="preserve">[ ] Replace bracketed fields.</w:t>
+        <w:t xml:space="preserve">☐  Replace bracketed fields.</w:t>
       </w:r>
     </w:p>
     <w:p>
@@ -95,7 +138,7 @@
         <w:pStyle w:val="Checklist"/>
       </w:pPr>
       <w:r>
-        <w:t xml:space="preserve">[ ] Verify facts and claims.</w:t>
+        <w:t xml:space="preserve">☐  Verify facts and claims.</w:t>
       </w:r>
     </w:p>
     <w:p>
@@ -103,7 +146,7 @@
         <w:pStyle w:val="Checklist"/>
       </w:pPr>
       <w:r>
-        <w:t xml:space="preserve">[ ] Send for approval before publishing.</w:t>
+        <w:t xml:space="preserve">☐  Send for approval before publishing.</w:t>
       </w:r>
     </w:p>
     <w:p>
@@ -116,131 +159,7 @@
         <w:pStyle w:val="Heading1"/>
       </w:pPr>
       <w:r>
-        <w:t xml:space="preserve">01 / Pack Snapshot</w:t>
-      </w:r>
-    </w:p>
-    <w:p>
-      <w:pPr>
-        <w:pStyle w:val="ListParagraph"/>
-        <w:numPr>
-          <w:ilvl w:val="0"/>
-          <w:numId w:val="1"/>
-        </w:numPr>
-      </w:pPr>
-      <w:r>
-        <w:t xml:space="preserve">Buyer: Trades businesses</w:t>
-      </w:r>
-    </w:p>
-    <w:p>
-      <w:pPr>
-        <w:pStyle w:val="ListParagraph"/>
-        <w:numPr>
-          <w:ilvl w:val="0"/>
-          <w:numId w:val="1"/>
-        </w:numPr>
-      </w:pPr>
-      <w:r>
-        <w:t xml:space="preserve">Category: AI Tool</w:t>
-      </w:r>
-    </w:p>
-    <w:p>
-      <w:pPr>
-        <w:pStyle w:val="ListParagraph"/>
-        <w:numPr>
-          <w:ilvl w:val="0"/>
-          <w:numId w:val="1"/>
-        </w:numPr>
-      </w:pPr>
-      <w:r>
-        <w:t xml:space="preserve">Startup cost: $1-$50</w:t>
-      </w:r>
-    </w:p>
-    <w:p>
-      <w:pPr>
-        <w:pStyle w:val="ListParagraph"/>
-        <w:numPr>
-          <w:ilvl w:val="0"/>
-          <w:numId w:val="1"/>
-        </w:numPr>
-      </w:pPr>
-      <w:r>
-        <w:t xml:space="preserve">Time to first sale: 2-4 weeks</w:t>
-      </w:r>
-    </w:p>
-    <w:p>
-      <w:pPr>
-        <w:pStyle w:val="ListParagraph"/>
-        <w:numPr>
-          <w:ilvl w:val="0"/>
-          <w:numId w:val="1"/>
-        </w:numPr>
-      </w:pPr>
-      <w:r>
-        <w:t xml:space="preserve">Difficulty: Medium</w:t>
-      </w:r>
-    </w:p>
-    <w:p>
-      <w:pPr>
-        <w:pStyle w:val="ListParagraph"/>
-        <w:numPr>
-          <w:ilvl w:val="0"/>
-          <w:numId w:val="1"/>
-        </w:numPr>
-      </w:pPr>
-      <w:r>
-        <w:t xml:space="preserve">Positioning hook: Plumbers do not need an AI agent. They need inbox triage.</w:t>
-      </w:r>
-    </w:p>
-    <w:p>
-      <w:pPr>
-        <w:pStyle w:val="Heading1"/>
-      </w:pPr>
-      <w:r>
-        <w:t xml:space="preserve">02 / Asset objective</w:t>
-      </w:r>
-    </w:p>
-    <w:p>
-      <w:pPr>
-        <w:pStyle w:val="ListParagraph"/>
-        <w:numPr>
-          <w:ilvl w:val="0"/>
-          <w:numId w:val="1"/>
-        </w:numPr>
-      </w:pPr>
-      <w:r>
-        <w:t xml:space="preserve">Trades businesses lose leads when messages sit unanswered or arrive without clear job details.</w:t>
-      </w:r>
-    </w:p>
-    <w:p>
-      <w:pPr>
-        <w:pStyle w:val="ListParagraph"/>
-        <w:numPr>
-          <w:ilvl w:val="0"/>
-          <w:numId w:val="1"/>
-        </w:numPr>
-      </w:pPr>
-      <w:r>
-        <w:t xml:space="preserve">Keep the promise concrete: Keep human approval in the loop.</w:t>
-      </w:r>
-    </w:p>
-    <w:p>
-      <w:pPr>
-        <w:pStyle w:val="ListParagraph"/>
-        <w:numPr>
-          <w:ilvl w:val="0"/>
-          <w:numId w:val="1"/>
-        </w:numPr>
-      </w:pPr>
-      <w:r>
-        <w:t xml:space="preserve">Use this asset to create a buyer-ready deliverable, not as a generic brainstorming note.</w:t>
-      </w:r>
-    </w:p>
-    <w:p>
-      <w:pPr>
-        <w:pStyle w:val="Heading1"/>
-      </w:pPr>
-      <w:r>
-        <w:t xml:space="preserve">03 / How to use these prompts</w:t>
+        <w:t xml:space="preserve">01 / How to use these prompts</w:t>
       </w:r>
     </w:p>
     <w:p>
@@ -284,7 +203,7 @@
         <w:pStyle w:val="Heading1"/>
       </w:pPr>
       <w:r>
-        <w:t xml:space="preserve">04 / Inbox triage prompts</w:t>
+        <w:t xml:space="preserve">02 / Inbox triage prompts</w:t>
       </w:r>
     </w:p>
     <w:p>
@@ -328,7 +247,7 @@
         <w:pStyle w:val="Heading1"/>
       </w:pPr>
       <w:r>
-        <w:t xml:space="preserve">05 / Reply prompts</w:t>
+        <w:t xml:space="preserve">03 / Reply prompts</w:t>
       </w:r>
     </w:p>
     <w:p>
@@ -372,7 +291,7 @@
         <w:pStyle w:val="Heading1"/>
       </w:pPr>
       <w:r>
-        <w:t xml:space="preserve">06 / Sales and delivery prompts</w:t>
+        <w:t xml:space="preserve">04 / Sales and delivery prompts</w:t>
       </w:r>
     </w:p>
     <w:p>
@@ -416,7 +335,7 @@
         <w:pStyle w:val="Heading1"/>
       </w:pPr>
       <w:r>
-        <w:t xml:space="preserve">07 / Prompt quality rules</w:t>
+        <w:t xml:space="preserve">05 / Prompt quality rules</w:t>
       </w:r>
     </w:p>
     <w:p>
@@ -484,7 +403,7 @@
         <w:pStyle w:val="Heading1"/>
       </w:pPr>
       <w:r>
-        <w:t xml:space="preserve">08 / Final QA prompt</w:t>
+        <w:t xml:space="preserve">06 / Final QA prompt</w:t>
       </w:r>
     </w:p>
     <w:p>
@@ -504,7 +423,7 @@
         <w:pStyle w:val="Heading1"/>
       </w:pPr>
       <w:r>
-        <w:t xml:space="preserve">09 / Buyer-ready deliverable standard</w:t>
+        <w:t xml:space="preserve">07 / Buyer-ready deliverable standard</w:t>
       </w:r>
     </w:p>
     <w:p>
@@ -560,7 +479,7 @@
         <w:pStyle w:val="Heading1"/>
       </w:pPr>
       <w:r>
-        <w:t xml:space="preserve">10 / Inputs to collect before delivery</w:t>
+        <w:t xml:space="preserve">08 / Inputs to collect before delivery</w:t>
       </w:r>
     </w:p>
     <w:p>
@@ -628,7 +547,7 @@
         <w:pStyle w:val="Heading1"/>
       </w:pPr>
       <w:r>
-        <w:t xml:space="preserve">11 / Evidence capture for renewal or case study</w:t>
+        <w:t xml:space="preserve">09 / Evidence capture for renewal or case study</w:t>
       </w:r>
     </w:p>
     <w:p>
@@ -696,7 +615,7 @@
         <w:pStyle w:val="Heading1"/>
       </w:pPr>
       <w:r>
-        <w:t xml:space="preserve">12 / Client handoff message</w:t>
+        <w:t xml:space="preserve">10 / Client handoff message</w:t>
       </w:r>
     </w:p>
     <w:p>
@@ -740,7 +659,7 @@
         <w:pStyle w:val="Heading1"/>
       </w:pPr>
       <w:r>
-        <w:t xml:space="preserve">13 / Pricing and scope guardrails</w:t>
+        <w:t xml:space="preserve">11 / Pricing and scope guardrails</w:t>
       </w:r>
     </w:p>
     <w:p>
@@ -796,7 +715,7 @@
         <w:pStyle w:val="Heading1"/>
       </w:pPr>
       <w:r>
-        <w:t xml:space="preserve">14 / Final QA before sending</w:t>
+        <w:t xml:space="preserve">12 / Final QA before sending</w:t>
       </w:r>
     </w:p>
     <w:p>
@@ -887,17 +806,17 @@
   <w:p>
     <w:pPr>
       <w:pBdr>
-        <w:top w:val="single" w:sz="4" w:space="3" w:color="D7DEE6"/>
+        <w:top w:val="single" w:sz="4" w:space="3" w:color="E0DFDD"/>
       </w:pBdr>
       <w:jc w:val="center"/>
     </w:pPr>
     <w:r>
       <w:rPr>
-        <w:rFonts w:ascii="Aptos" w:hAnsi="Aptos"/>
+        <w:rFonts w:ascii="Arial" w:hAnsi="Arial"/>
         <w:sz w:val="16"/>
-        <w:color w:val="5E6774"/>
+        <w:color w:val="57534E"/>
       </w:rPr>
-      <w:t xml:space="preserve">Side Hustle Stephen - The Launchpad | AI Inbox Triage for Trades | Verify facts before client use</w:t>
+      <w:t xml:space="preserve">Side Hustle Stephen - The Launchpad  /  AI Inbox Triage for Trades  /  Verify facts before client use</w:t>
     </w:r>
   </w:p>
 </w:ftr>
@@ -909,9 +828,9 @@
     <w:lvl w:ilvl="0">
       <w:start w:val="1"/>
       <w:numFmt w:val="bullet"/>
-      <w:lvlText w:val="•"/>
-      <w:pPr>
-        <w:ind w:left="720" w:hanging="240"/>
+      <w:lvlText w:val="–"/>
+      <w:pPr>
+        <w:ind w:left="540" w:hanging="220"/>
       </w:pPr>
     </w:lvl>
   </w:abstractNum>
@@ -926,60 +845,91 @@
   <w:style w:type="paragraph" w:default="1" w:styleId="Normal">
     <w:name w:val="Normal"/>
     <w:rPr>
-      <w:rFonts w:ascii="Aptos" w:hAnsi="Aptos"/>
+      <w:rFonts w:ascii="Arial" w:hAnsi="Arial"/>
       <w:sz w:val="21"/>
-      <w:color w:val="070A0F"/>
+      <w:color w:val="0A0A0A"/>
     </w:rPr>
     <w:pPr>
       <w:spacing w:after="150" w:line="300" w:lineRule="auto"/>
       <w:widowControl/>
     </w:pPr>
   </w:style>
+  <w:style w:type="paragraph" w:styleId="BrandBand">
+    <w:name w:val="BrandBand"/>
+    <w:rPr>
+      <w:rFonts w:ascii="Arial" w:hAnsi="Arial"/>
+      <w:b/>
+      <w:caps/>
+      <w:sz w:val="15"/>
+      <w:color w:val="0A0A0A"/>
+      <w:spacing w:val="30"/>
+    </w:rPr>
+    <w:pPr>
+      <w:pBdr>
+        <w:bottom w:val="single" w:sz="18" w:space="6" w:color="0A0A0A"/>
+      </w:pBdr>
+      <w:spacing w:before="0" w:after="240"/>
+      <w:jc w:val="left"/>
+    </w:pPr>
+  </w:style>
   <w:style w:type="paragraph" w:styleId="Title">
     <w:name w:val="Title"/>
     <w:rPr>
-      <w:rFonts w:ascii="Aptos Display" w:hAnsi="Aptos Display"/>
+      <w:rFonts w:ascii="Arial" w:hAnsi="Arial"/>
       <w:b/>
-      <w:sz w:val="50"/>
-      <w:color w:val="12172A"/>
-    </w:rPr>
-    <w:pPr>
-      <w:spacing w:before="90" w:after="140" w:line="920" w:lineRule="auto"/>
+      <w:sz w:val="56"/>
+      <w:color w:val="0A0A0A"/>
+      <w:spacing w:val="-10"/>
+    </w:rPr>
+    <w:pPr>
+      <w:spacing w:before="60" w:after="60" w:line="300" w:lineRule="auto"/>
       <w:keepNext/>
     </w:pPr>
   </w:style>
   <w:style w:type="paragraph" w:styleId="Subtitle">
     <w:name w:val="Subtitle"/>
     <w:rPr>
-      <w:rFonts w:ascii="Aptos" w:hAnsi="Aptos"/>
+      <w:rFonts w:ascii="Arial" w:hAnsi="Arial"/>
       <w:b/>
       <w:caps/>
       <w:sz w:val="16"/>
-      <w:color w:val="A53A00"/>
+      <w:color w:val="57534E"/>
     </w:rPr>
     <w:pPr>
       <w:spacing w:after="120"/>
+    </w:pPr>
+  </w:style>
+  <w:style w:type="paragraph" w:styleId="Tagline">
+    <w:name w:val="Tagline"/>
+    <w:rPr>
+      <w:rFonts w:ascii="Arial" w:hAnsi="Arial"/>
+      <w:sz w:val="22"/>
+      <w:color w:val="0A59D2"/>
+    </w:rPr>
+    <w:pPr>
+      <w:spacing w:before="0" w:after="150" w:line="300" w:lineRule="auto"/>
     </w:pPr>
   </w:style>
   <w:style w:type="paragraph" w:styleId="Lead">
     <w:name w:val="Lead"/>
     <w:rPr>
-      <w:rFonts w:ascii="Aptos" w:hAnsi="Aptos"/>
+      <w:rFonts w:ascii="Arial" w:hAnsi="Arial"/>
       <w:sz w:val="24"/>
-      <w:color w:val="5E6774"/>
-    </w:rPr>
-    <w:pPr>
-      <w:spacing w:before="80" w:after="160" w:line="340" w:lineRule="auto"/>
+      <w:color w:val="0A0A0A"/>
+    </w:rPr>
+    <w:pPr>
+      <w:spacing w:before="80" w:after="60" w:line="340" w:lineRule="auto"/>
     </w:pPr>
   </w:style>
   <w:style w:type="paragraph" w:styleId="Kicker">
     <w:name w:val="Kicker"/>
     <w:rPr>
-      <w:rFonts w:ascii="Aptos" w:hAnsi="Aptos"/>
+      <w:rFonts w:ascii="Arial" w:hAnsi="Arial"/>
       <w:b/>
       <w:caps/>
       <w:sz w:val="15"/>
-      <w:color w:val="A53A00"/>
+      <w:color w:val="57534E"/>
+      <w:spacing w:val="24"/>
     </w:rPr>
     <w:pPr>
       <w:spacing w:before="180" w:after="70"/>
@@ -988,38 +938,39 @@
   <w:style w:type="paragraph" w:styleId="Heading1">
     <w:name w:val="heading 1"/>
     <w:rPr>
-      <w:rFonts w:ascii="Aptos Display" w:hAnsi="Aptos Display"/>
+      <w:rFonts w:ascii="Arial" w:hAnsi="Arial"/>
       <w:b/>
-      <w:sz w:val="25"/>
-      <w:color w:val="12172A"/>
+      <w:sz w:val="26"/>
+      <w:color w:val="0A0A0A"/>
+      <w:spacing w:val="-4"/>
     </w:rPr>
     <w:pPr>
       <w:keepNext/>
-      <w:spacing w:before="320" w:after="120"/>
+      <w:spacing w:before="340" w:after="130"/>
       <w:pBdr>
-        <w:bottom w:val="single" w:sz="6" w:space="5" w:color="D7DEE6"/>
+        <w:bottom w:val="single" w:sz="6" w:space="6" w:color="E0DFDD"/>
       </w:pBdr>
     </w:pPr>
   </w:style>
   <w:style w:type="paragraph" w:styleId="Heading2">
     <w:name w:val="heading 2"/>
     <w:rPr>
-      <w:rFonts w:ascii="Aptos" w:hAnsi="Aptos"/>
+      <w:rFonts w:ascii="Arial" w:hAnsi="Arial"/>
       <w:b/>
       <w:sz w:val="23"/>
-      <w:color w:val="5E6774"/>
-    </w:rPr>
-    <w:pPr>
-      <w:spacing w:after="130"/>
+      <w:color w:val="57534E"/>
+    </w:rPr>
+    <w:pPr>
+      <w:spacing w:after="60"/>
     </w:pPr>
   </w:style>
   <w:style w:type="paragraph" w:styleId="Heading3">
     <w:name w:val="heading 3"/>
     <w:rPr>
-      <w:rFonts w:ascii="Aptos" w:hAnsi="Aptos"/>
+      <w:rFonts w:ascii="Arial" w:hAnsi="Arial"/>
       <w:b/>
       <w:sz w:val="20"/>
-      <w:color w:val="12172A"/>
+      <w:color w:val="0A0A0A"/>
     </w:rPr>
     <w:pPr>
       <w:spacing w:before="150" w:after="80"/>
@@ -1028,10 +979,10 @@
   <w:style w:type="paragraph" w:styleId="Meta">
     <w:name w:val="Meta"/>
     <w:rPr>
-      <w:rFonts w:ascii="Aptos" w:hAnsi="Aptos"/>
+      <w:rFonts w:ascii="Arial" w:hAnsi="Arial"/>
       <w:b/>
       <w:sz w:val="18"/>
-      <w:color w:val="5E6774"/>
+      <w:color w:val="57534E"/>
     </w:rPr>
     <w:pPr>
       <w:spacing w:after="95"/>
@@ -1040,9 +991,9 @@
   <w:style w:type="paragraph" w:styleId="ListParagraph">
     <w:name w:val="List Paragraph"/>
     <w:rPr>
-      <w:rFonts w:ascii="Aptos" w:hAnsi="Aptos"/>
+      <w:rFonts w:ascii="Arial" w:hAnsi="Arial"/>
       <w:sz w:val="20"/>
-      <w:color w:val="070A0F"/>
+      <w:color w:val="0A0A0A"/>
     </w:rPr>
     <w:pPr>
       <w:spacing w:after="110" w:line="292" w:lineRule="auto"/>
@@ -1053,31 +1004,31 @@
   <w:style w:type="paragraph" w:styleId="Checklist">
     <w:name w:val="Checklist"/>
     <w:rPr>
-      <w:rFonts w:ascii="Aptos" w:hAnsi="Aptos"/>
+      <w:rFonts w:ascii="Arial" w:hAnsi="Arial"/>
       <w:b/>
       <w:sz w:val="20"/>
-      <w:color w:val="12172A"/>
+      <w:color w:val="0A0A0A"/>
     </w:rPr>
     <w:pPr>
       <w:spacing w:after="92" w:line="280" w:lineRule="auto"/>
-      <w:shd w:fill="F7FAFC"/>
+      <w:shd w:fill="F5F3F1"/>
       <w:pBdr>
-        <w:left w:val="single" w:sz="10" w:space="8" w:color="D7DEE6"/>
+        <w:left w:val="single" w:sz="14" w:space="8" w:color="0A0A0A"/>
       </w:pBdr>
     </w:pPr>
   </w:style>
   <w:style w:type="paragraph" w:styleId="IntenseQuote">
     <w:name w:val="Intense Quote"/>
     <w:rPr>
-      <w:i/>
-      <w:color w:val="12172A"/>
+      <w:rFonts w:ascii="Arial" w:hAnsi="Arial"/>
+      <w:color w:val="0A0A0A"/>
       <w:sz w:val="20"/>
     </w:rPr>
     <w:pPr>
       <w:spacing w:before="90" w:after="170" w:line="292" w:lineRule="auto"/>
-      <w:shd w:fill="FFF1E7"/>
+      <w:shd w:fill="F5F3F1"/>
       <w:pBdr>
-        <w:left w:val="single" w:sz="18" w:space="8" w:color="D94A00"/>
+        <w:left w:val="single" w:sz="18" w:space="10" w:color="0A0A0A"/>
       </w:pBdr>
     </w:pPr>
   </w:style>

</xml_diff>